<commit_message>
Email: Brevo only, remove legacy SMTP path and old addresses; use SQL_PATH/SQL_COPY from tide.env in changealertpw.cgi and tideplot.py; manual updates
</commit_message>
<xml_diff>
--- a/ACTION_Technical_Manual.docx
+++ b/ACTION_Technical_Manual.docx
@@ -14410,7 +14410,7 @@
         <w:jc w:val="both"/>
       </w:pPr>
       <w:r>
-        <w:t xml:space="preserve">Email is sent through Brevo's SMTP relay (EMAIL_SERVICE='brevo' in tide.env), using smtplib from Python's standard library with STARTTLS on SMTP_PORT (normally 587). The Brevo login, sending address and SMTP server are in tide_constants.json. If EMAIL_SERVICE is set to anything else, a generic SMTP server (SMTP_SERVER, EMAIL_USERNAME and EMAIL_PASSWORD) is used instead.</w:t>
+        <w:t xml:space="preserve">Email is sent through Brevo's SMTP relay, the only email service the station uses, with smtplib from Python's standard library and STARTTLS on SMTP_PORT (tide.env, normally 587). The Brevo SMTP server, login and sending address are in tide_constants.json. Every message is sent from the Brevo sending address (BREVO_EMAIL_ADDRESS), which also identifies the station to the National Weather Service's forecast service.</w:t>
       </w:r>
     </w:p>
     <w:p>
@@ -16984,7 +16984,7 @@
           <w:sz w:val="21"/>
           <w:szCs w:val="21"/>
         </w:rPr>
-        <w:t xml:space="preserve">Hardcoded database paths</w:t>
+        <w:t xml:space="preserve">Failed alerts are not retried</w:t>
       </w:r>
       <w:bookmarkEnd w:id="9068"/>
     </w:p>
@@ -16994,31 +16994,7 @@
         <w:jc w:val="both"/>
       </w:pPr>
       <w:r>
-        <w:t xml:space="preserve">changealertpw.cgi opens </w:t>
-      </w:r>
-      <w:r>
-        <w:rPr>
-          <w:rFonts w:ascii="Consolas" w:eastAsia="Consolas" w:hAnsi="Consolas" w:cs="Consolas"/>
-          <w:color w:val="1A1A1A"/>
-          <w:sz w:val="19"/>
-          <w:szCs w:val="19"/>
-        </w:rPr>
-        <w:t xml:space="preserve">/var/www/html/tides.db</w:t>
-      </w:r>
-      <w:r>
-        <w:t xml:space="preserve">, and tideplot.py opens </w:t>
-      </w:r>
-      <w:r>
-        <w:rPr>
-          <w:rFonts w:ascii="Consolas" w:eastAsia="Consolas" w:hAnsi="Consolas" w:cs="Consolas"/>
-          <w:color w:val="1A1A1A"/>
-          <w:sz w:val="19"/>
-          <w:szCs w:val="19"/>
-        </w:rPr>
-        <w:t xml:space="preserve">/home/tide/Uploads/tides.db</w:t>
-      </w:r>
-      <w:r>
-        <w:t xml:space="preserve">, instead of using SQL_PATH and SQL_COPY from tide.env. Both work with the default paths but would break if either were changed.</w:t>
+        <w:t xml:space="preserve">An alert email or SMS that fails to send is logged and dropped. Only website email, which goes through the mail spool, is retried (Section 7.4). That may be acceptable, since a late alert has limited value, but it should be a deliberate choice.</w:t>
       </w:r>
     </w:p>
     <w:p>
@@ -17036,7 +17012,7 @@
           <w:sz w:val="21"/>
           <w:szCs w:val="21"/>
         </w:rPr>
-        <w:t xml:space="preserve">Failed alerts are not retried</w:t>
+        <w:t xml:space="preserve">Automatic failover needs updating for three sensors</w:t>
       </w:r>
       <w:bookmarkEnd w:id="9069"/>
     </w:p>
@@ -17046,7 +17022,7 @@
         <w:jc w:val="both"/>
       </w:pPr>
       <w:r>
-        <w:t xml:space="preserve">An alert email or SMS that fails to send is logged and dropped. Only website email, which goes through the mail spool, is retried (Section 7.4). That may be acceptable, since a late alert has limited value, but it should be a deliberate choice.</w:t>
+        <w:t xml:space="preserve">The out-of-service check (Section 3.4) dates from before the third sensor slot was added, and still only switches between slots 1 and 2. A station whose primary sensor is in slot 3 gets the out-of-service notice but no automatic switch, and a slot 3 sensor is never chosen as the replacement. This needs reworking to handle all three slots.</w:t>
       </w:r>
     </w:p>
     <w:p>
@@ -17055,62 +17031,6 @@
         <w:spacing w:before="200" w:after="80"/>
       </w:pPr>
       <w:bookmarkStart w:id="9070" w:name="_Toc99070"/>
-      <w:r>
-        <w:rPr>
-          <w:rFonts w:ascii="Arial" w:eastAsia="Arial" w:hAnsi="Arial" w:cs="Arial"/>
-          <w:b/>
-          <w:bCs/>
-          <w:color w:val="222222"/>
-          <w:sz w:val="21"/>
-          <w:szCs w:val="21"/>
-        </w:rPr>
-        <w:t xml:space="preserve">Generic SMTP fallback incomplete</w:t>
-      </w:r>
-      <w:bookmarkEnd w:id="9070"/>
-    </w:p>
-    <w:p>
-      <w:pPr>
-        <w:spacing w:before="60" w:after="100"/>
-        <w:jc w:val="both"/>
-      </w:pPr>
-      <w:r>
-        <w:t xml:space="preserve">When EMAIL_SERVICE is not brevo, tidehelper.py reads SMTP_SERVER from tide.env, but SMTP_SERVER is missing from tide.env.template; it still appears in tide_constants.json.template, where the code no longer reads it. The fallback would fail as installed. Brevo, the service every station uses, is unaffected.</w:t>
-      </w:r>
-    </w:p>
-    <w:p>
-      <w:pPr>
-        <w:pStyle w:val="Heading3"/>
-        <w:spacing w:before="200" w:after="80"/>
-      </w:pPr>
-      <w:bookmarkStart w:id="9071" w:name="_Toc99071"/>
-      <w:r>
-        <w:rPr>
-          <w:rFonts w:ascii="Arial" w:eastAsia="Arial" w:hAnsi="Arial" w:cs="Arial"/>
-          <w:b/>
-          <w:bCs/>
-          <w:color w:val="222222"/>
-          <w:sz w:val="21"/>
-          <w:szCs w:val="21"/>
-        </w:rPr>
-        <w:t xml:space="preserve">Automatic failover covers sensor slots 1 and 2 only</w:t>
-      </w:r>
-      <w:bookmarkEnd w:id="9071"/>
-    </w:p>
-    <w:p>
-      <w:pPr>
-        <w:spacing w:before="60" w:after="100"/>
-        <w:jc w:val="both"/>
-      </w:pPr>
-      <w:r>
-        <w:t xml:space="preserve">The out-of-service check (Section 3.4) switches between slots 1 and 2. A station whose primary sensor is in slot 3 gets the out-of-service notice but no automatic switch.</w:t>
-      </w:r>
-    </w:p>
-    <w:p>
-      <w:pPr>
-        <w:pStyle w:val="Heading3"/>
-        <w:spacing w:before="200" w:after="80"/>
-      </w:pPr>
-      <w:bookmarkStart w:id="9072" w:name="_Toc99072"/>
       <w:r>
         <w:rPr>
           <w:rFonts w:ascii="Arial" w:eastAsia="Arial" w:hAnsi="Arial" w:cs="Arial"/>
@@ -17122,7 +17042,7 @@
         </w:rPr>
         <w:t xml:space="preserve">Duplicate sun-calculation packages</w:t>
       </w:r>
-      <w:bookmarkEnd w:id="9072"/>
+      <w:bookmarkEnd w:id="9070"/>
     </w:p>
     <w:p>
       <w:pPr>
@@ -17138,7 +17058,7 @@
         <w:pStyle w:val="Heading3"/>
         <w:spacing w:before="200" w:after="80"/>
       </w:pPr>
-      <w:bookmarkStart w:id="9073" w:name="_Toc99073"/>
+      <w:bookmarkStart w:id="9071" w:name="_Toc99071"/>
       <w:r>
         <w:rPr>
           <w:rFonts w:ascii="Arial" w:eastAsia="Arial" w:hAnsi="Arial" w:cs="Arial"/>
@@ -17150,7 +17070,7 @@
         </w:rPr>
         <w:t xml:space="preserve">Inactive code retained deliberately</w:t>
       </w:r>
-      <w:bookmarkEnd w:id="9073"/>
+      <w:bookmarkEnd w:id="9071"/>
     </w:p>
     <w:p>
       <w:pPr>
@@ -17174,7 +17094,7 @@
         </w:pBdr>
         <w:spacing w:before="480" w:after="160"/>
       </w:pPr>
-      <w:bookmarkStart w:id="9074" w:name="_Toc99074"/>
+      <w:bookmarkStart w:id="9072" w:name="_Toc99072"/>
       <w:r>
         <w:rPr>
           <w:rFonts w:ascii="Arial" w:eastAsia="Arial" w:hAnsi="Arial" w:cs="Arial"/>
@@ -17186,14 +17106,14 @@
         </w:rPr>
         <w:t xml:space="preserve">13. Appendices</w:t>
       </w:r>
-      <w:bookmarkEnd w:id="9074"/>
+      <w:bookmarkEnd w:id="9072"/>
     </w:p>
     <w:p>
       <w:pPr>
         <w:pStyle w:val="Heading2"/>
         <w:spacing w:before="280" w:after="100"/>
       </w:pPr>
-      <w:bookmarkStart w:id="9075" w:name="_Toc99075"/>
+      <w:bookmarkStart w:id="9073" w:name="_Toc99073"/>
       <w:r>
         <w:rPr>
           <w:rFonts w:ascii="Arial" w:eastAsia="Arial" w:hAnsi="Arial" w:cs="Arial"/>
@@ -17205,7 +17125,7 @@
         </w:rPr>
         <w:t xml:space="preserve">Appendix A -- tide.env Reference</w:t>
       </w:r>
-      <w:bookmarkEnd w:id="9075"/>
+      <w:bookmarkEnd w:id="9073"/>
     </w:p>
     <w:p>
       <w:pPr>
@@ -17610,7 +17530,7 @@
                 <w:sz w:val="20"/>
                 <w:szCs w:val="20"/>
               </w:rPr>
-              <w:t xml:space="preserve">EMAIL_SERVICE / SMTP_PORT</w:t>
+              <w:t xml:space="preserve">SMTP_PORT</w:t>
             </w:r>
           </w:p>
         </w:tc>
@@ -17632,7 +17552,7 @@
                 <w:sz w:val="20"/>
                 <w:szCs w:val="20"/>
               </w:rPr>
-              <w:t xml:space="preserve">Email route (brevo) and SMTP port (Section 9.1).</w:t>
+              <w:t xml:space="preserve">SMTP port for the Brevo relay, normally 587 (Section 9.1).</w:t>
             </w:r>
           </w:p>
         </w:tc>
@@ -18182,7 +18102,7 @@
         <w:pStyle w:val="Heading2"/>
         <w:spacing w:before="280" w:after="100"/>
       </w:pPr>
-      <w:bookmarkStart w:id="9076" w:name="_Toc99076"/>
+      <w:bookmarkStart w:id="9074" w:name="_Toc99074"/>
       <w:r>
         <w:rPr>
           <w:rFonts w:ascii="Arial" w:eastAsia="Arial" w:hAnsi="Arial" w:cs="Arial"/>
@@ -18194,7 +18114,7 @@
         </w:rPr>
         <w:t xml:space="preserve">Appendix B -- Services and Scheduled Jobs</w:t>
       </w:r>
-      <w:bookmarkEnd w:id="9076"/>
+      <w:bookmarkEnd w:id="9074"/>
     </w:p>
     <w:tbl>
       <w:tblPr>
@@ -18644,7 +18564,7 @@
         <w:pStyle w:val="Heading2"/>
         <w:spacing w:before="280" w:after="100"/>
       </w:pPr>
-      <w:bookmarkStart w:id="9077" w:name="_Toc99077"/>
+      <w:bookmarkStart w:id="9075" w:name="_Toc99075"/>
       <w:r>
         <w:rPr>
           <w:rFonts w:ascii="Arial" w:eastAsia="Arial" w:hAnsi="Arial" w:cs="Arial"/>
@@ -18656,7 +18576,7 @@
         </w:rPr>
         <w:t xml:space="preserve">Appendix C -- Files and Locations</w:t>
       </w:r>
-      <w:bookmarkEnd w:id="9077"/>
+      <w:bookmarkEnd w:id="9075"/>
     </w:p>
     <w:tbl>
       <w:tblPr>
@@ -19134,7 +19054,7 @@
         <w:pStyle w:val="Heading2"/>
         <w:spacing w:before="280" w:after="100"/>
       </w:pPr>
-      <w:bookmarkStart w:id="9078" w:name="_Toc99078"/>
+      <w:bookmarkStart w:id="9076" w:name="_Toc99076"/>
       <w:r>
         <w:rPr>
           <w:rFonts w:ascii="Arial" w:eastAsia="Arial" w:hAnsi="Arial" w:cs="Arial"/>
@@ -19146,7 +19066,7 @@
         </w:rPr>
         <w:t xml:space="preserve">Appendix D -- Source Repository</w:t>
       </w:r>
-      <w:bookmarkEnd w:id="9078"/>
+      <w:bookmarkEnd w:id="9076"/>
     </w:p>
     <w:p>
       <w:pPr>

</xml_diff>

<commit_message>
Block HTTP access to tide.env, tides.db, mailspool and other data files in the web root; manual updates
</commit_message>
<xml_diff>
--- a/ACTION_Technical_Manual.docx
+++ b/ACTION_Technical_Manual.docx
@@ -4314,13 +4314,9 @@
       </w:r>
     </w:p>
     <w:p>
-      <w:r>
-        <w:br w:type="page"/>
-      </w:r>
-    </w:p>
-    <w:p>
       <w:pPr>
         <w:pStyle w:val="Heading1"/>
+        <w:pageBreakBefore/>
         <w:pBdr>
           <w:bottom w:val="single" w:sz="6" w:space="4" w:color="1F5C8B"/>
         </w:pBdr>
@@ -5738,17 +5734,38 @@
         <w:jc w:val="both"/>
       </w:pPr>
       <w:r>
-        <w:t xml:space="preserve">For issues that aren't resolved by a service restart or reboot, or that involve any of the caution items above, escalate to the system's maintainer rather than attempting further changes. [Ken: insert the contact path to document here (your own contact details, your colleague's, or a shared point of contact) and any response-time expectation for an autonomous site such as Lincoln Academy.]</w:t>
-      </w:r>
-    </w:p>
-    <w:p>
-      <w:r>
-        <w:br w:type="page"/>
+        <w:t xml:space="preserve">For issues that aren't resolved by a service restart or reboot, or that involve any of the caution items above, escalate to the system's maintainer rather than attempting further changes.</w:t>
+      </w:r>
+    </w:p>
+    <w:p>
+      <w:pPr>
+        <w:spacing w:before="60" w:after="100"/>
+        <w:jc w:val="both"/>
+      </w:pPr>
+      <w:r>
+        <w:rPr>
+          <w:b/>
+          <w:bCs/>
+        </w:rPr>
+        <w:t xml:space="preserve">Contact:</w:t>
+      </w:r>
+      <w:r>
+        <w:t xml:space="preserve"> cfi1513840@gmail.com</w:t>
+      </w:r>
+    </w:p>
+    <w:p>
+      <w:pPr>
+        <w:spacing w:before="60" w:after="100"/>
+        <w:jc w:val="both"/>
+      </w:pPr>
+      <w:r>
+        <w:t xml:space="preserve">Include the station's name or domain, what you observed and when, anything you have already tried (Sections 2.3 and 2.4), and any relevant lines from newtide.log or the systemd journal.</w:t>
       </w:r>
     </w:p>
     <w:p>
       <w:pPr>
         <w:pStyle w:val="Heading1"/>
+        <w:pageBreakBefore/>
         <w:pBdr>
           <w:bottom w:val="single" w:sz="6" w:space="4" w:color="1F5C8B"/>
         </w:pBdr>
@@ -6913,13 +6930,9 @@
       </w:r>
     </w:p>
     <w:p>
-      <w:r>
-        <w:br w:type="page"/>
-      </w:r>
-    </w:p>
-    <w:p>
       <w:pPr>
         <w:pStyle w:val="Heading1"/>
+        <w:pageBreakBefore/>
         <w:pBdr>
           <w:bottom w:val="single" w:sz="6" w:space="4" w:color="1F5C8B"/>
         </w:pBdr>
@@ -7693,13 +7706,9 @@
       </w:r>
     </w:p>
     <w:p>
-      <w:r>
-        <w:br w:type="page"/>
-      </w:r>
-    </w:p>
-    <w:p>
       <w:pPr>
         <w:pStyle w:val="Heading1"/>
+        <w:pageBreakBefore/>
         <w:pBdr>
           <w:bottom w:val="single" w:sz="6" w:space="4" w:color="1F5C8B"/>
         </w:pBdr>
@@ -9575,13 +9584,9 @@
       </w:tr>
     </w:tbl>
     <w:p>
-      <w:r>
-        <w:br w:type="page"/>
-      </w:r>
-    </w:p>
-    <w:p>
       <w:pPr>
         <w:pStyle w:val="Heading1"/>
+        <w:pageBreakBefore/>
         <w:pBdr>
           <w:bottom w:val="single" w:sz="6" w:space="4" w:color="1F5C8B"/>
         </w:pBdr>
@@ -11976,13 +11981,9 @@
       </w:r>
     </w:p>
     <w:p>
-      <w:r>
-        <w:br w:type="page"/>
-      </w:r>
-    </w:p>
-    <w:p>
       <w:pPr>
         <w:pStyle w:val="Heading1"/>
+        <w:pageBreakBefore/>
         <w:pBdr>
           <w:bottom w:val="single" w:sz="6" w:space="4" w:color="1F5C8B"/>
         </w:pBdr>
@@ -13006,13 +13007,9 @@
       </w:r>
     </w:p>
     <w:p>
-      <w:r>
-        <w:br w:type="page"/>
-      </w:r>
-    </w:p>
-    <w:p>
       <w:pPr>
         <w:pStyle w:val="Heading1"/>
+        <w:pageBreakBefore/>
         <w:pBdr>
           <w:bottom w:val="single" w:sz="6" w:space="4" w:color="1F5C8B"/>
         </w:pBdr>
@@ -14350,13 +14347,9 @@
       </w:r>
     </w:p>
     <w:p>
-      <w:r>
-        <w:br w:type="page"/>
-      </w:r>
-    </w:p>
-    <w:p>
       <w:pPr>
         <w:pStyle w:val="Heading1"/>
+        <w:pageBreakBefore/>
         <w:pBdr>
           <w:bottom w:val="single" w:sz="6" w:space="4" w:color="1F5C8B"/>
         </w:pBdr>
@@ -14919,13 +14912,9 @@
       </w:r>
     </w:p>
     <w:p>
-      <w:r>
-        <w:br w:type="page"/>
-      </w:r>
-    </w:p>
-    <w:p>
       <w:pPr>
         <w:pStyle w:val="Heading1"/>
+        <w:pageBreakBefore/>
         <w:pBdr>
           <w:bottom w:val="single" w:sz="6" w:space="4" w:color="1F5C8B"/>
         </w:pBdr>
@@ -15792,13 +15781,9 @@
       </w:r>
     </w:p>
     <w:p>
-      <w:r>
-        <w:br w:type="page"/>
-      </w:r>
-    </w:p>
-    <w:p>
       <w:pPr>
         <w:pStyle w:val="Heading1"/>
+        <w:pageBreakBefore/>
         <w:pBdr>
           <w:bottom w:val="single" w:sz="6" w:space="4" w:color="1F5C8B"/>
         </w:pBdr>
@@ -16826,13 +16811,9 @@
       </w:r>
     </w:p>
     <w:p>
-      <w:r>
-        <w:br w:type="page"/>
-      </w:r>
-    </w:p>
-    <w:p>
       <w:pPr>
         <w:pStyle w:val="Heading1"/>
+        <w:pageBreakBefore/>
         <w:pBdr>
           <w:bottom w:val="single" w:sz="6" w:space="4" w:color="1F5C8B"/>
         </w:pBdr>
@@ -17082,13 +17063,9 @@
       </w:r>
     </w:p>
     <w:p>
-      <w:r>
-        <w:br w:type="page"/>
-      </w:r>
-    </w:p>
-    <w:p>
       <w:pPr>
         <w:pStyle w:val="Heading1"/>
+        <w:pageBreakBefore/>
         <w:pBdr>
           <w:bottom w:val="single" w:sz="6" w:space="4" w:color="1F5C8B"/>
         </w:pBdr>

</xml_diff>

<commit_message>
Technical Manual 7.5: document the Apache rule protecting web-root data files
</commit_message>
<xml_diff>
--- a/ACTION_Technical_Manual.docx
+++ b/ACTION_Technical_Manual.docx
@@ -12979,6 +12979,19 @@
       </w:pPr>
       <w:r>
         <w:t xml:space="preserve">The Notehub receiver accepts an event only when its X-Auth header matches NOTEHUB_SECRET, and answers anything else with HTTP 401.</w:t>
+      </w:r>
+    </w:p>
+    <w:p>
+      <w:pPr>
+        <w:pStyle w:val="ListParagraph"/>
+        <w:numPr>
+          <w:ilvl w:val="0"/>
+          <w:numId w:val="2"/>
+        </w:numPr>
+        <w:spacing w:before="20" w:after="40"/>
+      </w:pPr>
+      <w:r>
+        <w:t xml:space="preserve">tide.env, tides.db and the mail spool live in the web root, where the CGI scripts can reach them. An Apache rule installed by install.sh (tide-protect.conf) refuses to serve them, or any .json, .db, .log, .tmp, .dev, .bak or .gz file there, over HTTP; a request for https://&lt;domain&gt;/tide.env should return 403.</w:t>
       </w:r>
     </w:p>
     <w:p>

</xml_diff>

<commit_message>
Add example tide.html screenshots; show on both manual covers
</commit_message>
<xml_diff>
--- a/ACTION_Technical_Manual.docx
+++ b/ACTION_Technical_Manual.docx
@@ -4,7 +4,7 @@
   <w:body>
     <w:p>
       <w:pPr>
-        <w:spacing w:before="2000"/>
+        <w:spacing w:before="900"/>
         <w:jc w:val="center"/>
       </w:pPr>
       <w:r>
@@ -68,7 +68,61 @@
     </w:p>
     <w:p>
       <w:pPr>
-        <w:spacing w:before="800"/>
+        <w:spacing w:before="480" w:after="80"/>
+        <w:jc w:val="center"/>
+      </w:pPr>
+      <w:r>
+        <w:drawing>
+          <wp:inline xmlns:a="http://schemas.openxmlformats.org/drawingml/2006/main" xmlns:pic="http://schemas.openxmlformats.org/drawingml/2006/picture">
+            <wp:extent cx="5943600" cy="4212691"/>
+            <wp:docPr id="1" name="Picture 1"/>
+            <wp:cNvGraphicFramePr>
+              <a:graphicFrameLocks noChangeAspect="1"/>
+            </wp:cNvGraphicFramePr>
+            <a:graphic>
+              <a:graphicData uri="http://schemas.openxmlformats.org/drawingml/2006/picture">
+                <pic:pic>
+                  <pic:nvPicPr>
+                    <pic:cNvPr id="0" name="tide_page_cover.png"/>
+                    <pic:cNvPicPr/>
+                  </pic:nvPicPr>
+                  <pic:blipFill>
+                    <a:blip r:embed="rId11"/>
+                    <a:stretch>
+                      <a:fillRect/>
+                    </a:stretch>
+                  </pic:blipFill>
+                  <pic:spPr>
+                    <a:xfrm>
+                      <a:off x="0" y="0"/>
+                      <a:ext cx="5943600" cy="4212691"/>
+                    </a:xfrm>
+                    <a:prstGeom prst="rect"/>
+                  </pic:spPr>
+                </pic:pic>
+              </a:graphicData>
+            </a:graphic>
+          </wp:inline>
+        </w:drawing>
+      </w:r>
+    </w:p>
+    <w:p>
+      <w:pPr>
+        <w:jc w:val="center"/>
+      </w:pPr>
+      <w:r>
+        <w:rPr>
+          <w:rFonts w:ascii="Arial" w:hAnsi="Arial"/>
+          <w:i/>
+          <w:color w:val="555555"/>
+          <w:sz w:val="18"/>
+        </w:rPr>
+        <w:t>Example station web page (tide.html), generated by tide.py: Belfast Harbor, September 27, 2026</w:t>
+      </w:r>
+    </w:p>
+    <w:p>
+      <w:pPr>
+        <w:spacing w:before="300"/>
         <w:jc w:val="center"/>
       </w:pPr>
       <w:r>
@@ -78,7 +132,7 @@
           <w:sz w:val="20"/>
           <w:szCs w:val="20"/>
         </w:rPr>
-        <w:t>Revision date: September 25, 2026</w:t>
+        <w:t>Revision date: September 27, 2026</w:t>
       </w:r>
     </w:p>
     <w:p>

</xml_diff>

<commit_message>
Add example tide.html screenshots; manual covers and Technical Manual Figure 1
</commit_message>
<xml_diff>
--- a/ACTION_Technical_Manual.docx
+++ b/ACTION_Technical_Manual.docx
@@ -13471,6 +13471,15 @@
     </w:p>
     <w:p>
       <w:pPr>
+        <w:spacing w:before="60" w:after="100"/>
+        <w:jc w:val="both"/>
+      </w:pPr>
+      <w:r>
+        <w:t xml:space="preserve">Figure 1, at the end of this section, shows a complete tide.html page. From the top: current local weather (OpenWeatherMap) and offshore conditions (NDBC buoy); the measured tide (blue) plotted against the NOAA prediction (grey), with the high and low tide markers and the current reading; the National Weather Service five-day forecast, detailed forecast and radar image; and the hourly marine point forecast. The image is also in the repository as docs/tide_page_full.png.</w:t>
+      </w:r>
+    </w:p>
+    <w:p>
+      <w:pPr>
         <w:pStyle w:val="Heading2"/>
         <w:spacing w:before="280" w:after="100"/>
       </w:pPr>
@@ -14411,6 +14420,62 @@
       </w:pPr>
       <w:r>
         <w:t xml:space="preserve">If set, this tide.env value, also used in email subjects, SMS messages and the Tk display's title, is read by sitename.cgi and put at the front of index.html's title: for example, "Belfast Harbor Tide Station Hub" instead of "Tide Station Hub". If it is unset, or sitename.cgi isn't installed, the page falls back to the generic title.</w:t>
+      </w:r>
+    </w:p>
+    <w:p>
+      <w:pPr>
+        <w:keepNext/>
+        <w:spacing w:before="120"/>
+        <w:jc w:val="center"/>
+      </w:pPr>
+      <w:r>
+        <w:drawing>
+          <wp:inline xmlns:a="http://schemas.openxmlformats.org/drawingml/2006/main" xmlns:pic="http://schemas.openxmlformats.org/drawingml/2006/picture">
+            <wp:extent cx="4572000" cy="7378180"/>
+            <wp:docPr id="2" name="Picture 2"/>
+            <wp:cNvGraphicFramePr>
+              <a:graphicFrameLocks noChangeAspect="1"/>
+            </wp:cNvGraphicFramePr>
+            <a:graphic>
+              <a:graphicData uri="http://schemas.openxmlformats.org/drawingml/2006/picture">
+                <pic:pic>
+                  <pic:nvPicPr>
+                    <pic:cNvPr id="0" name="tide_page_full.png"/>
+                    <pic:cNvPicPr/>
+                  </pic:nvPicPr>
+                  <pic:blipFill>
+                    <a:blip r:embed="rId12"/>
+                    <a:stretch>
+                      <a:fillRect/>
+                    </a:stretch>
+                  </pic:blipFill>
+                  <pic:spPr>
+                    <a:xfrm>
+                      <a:off x="0" y="0"/>
+                      <a:ext cx="4572000" cy="7378180"/>
+                    </a:xfrm>
+                    <a:prstGeom prst="rect"/>
+                  </pic:spPr>
+                </pic:pic>
+              </a:graphicData>
+            </a:graphic>
+          </wp:inline>
+        </w:drawing>
+      </w:r>
+    </w:p>
+    <w:p>
+      <w:pPr>
+        <w:spacing w:after="200"/>
+        <w:jc w:val="center"/>
+      </w:pPr>
+      <w:r>
+        <w:rPr>
+          <w:rFonts w:ascii="Arial" w:hAnsi="Arial"/>
+          <w:i/>
+          <w:color w:val="555555"/>
+          <w:sz w:val="18"/>
+        </w:rPr>
+        <w:t>Figure 1. A complete tide.html page, as generated by tide.py (Belfast Harbor, September 27, 2026).</w:t>
       </w:r>
     </w:p>
     <w:p>

</xml_diff>